<commit_message>
fix: Wrap docxtemplater loop tags in paragraph blocks to fix questionnaire data substitution in Daily Reports
- Docxtemplater Paragraph Loop Tag Fix:
  - Wrapped {#incidents} and {/incidents} (and {#weeks} and {/weeks}) inside OpenXML paragraph tags (<w:p>) in buildTemplates.mjs
  - Resolves docxtemplater scope resolution bug where loop block was skipped and questionnaire variables evaluated as undefined

- Verified Live Questionnaire Rendering:
  - Verified 100% data substitution for patient names (Ninyo Bancoro, Ken Arizobal), age, sex, address, intoxication, mechanism of injury, injuries observed, responders, vital signs (SaO2, Pulse, BP, GCS), and destination facility
</commit_message>
<xml_diff>
--- a/frontend/public/templates/weekly-template.docx
+++ b/frontend/public/templates/weekly-template.docx
@@ -2,7 +2,20 @@
 <file path=word/document.xml><?xml version="1.0" encoding="utf-8"?>
 <w:document xmlns:wpc="http://schemas.microsoft.com/office/word/2010/wordprocessingCanvas" xmlns:cx="http://schemas.microsoft.com/office/drawing/2014/chartex" xmlns:cx1="http://schemas.microsoft.com/office/drawing/2015/9/8/chartex" xmlns:cx2="http://schemas.microsoft.com/office/drawing/2015/10/21/chartex" xmlns:cx3="http://schemas.microsoft.com/office/drawing/2016/5/9/chartex" xmlns:cx4="http://schemas.microsoft.com/office/drawing/2016/5/10/chartex" xmlns:cx5="http://schemas.microsoft.com/office/drawing/2016/5/11/chartex" xmlns:cx6="http://schemas.microsoft.com/office/drawing/2016/5/12/chartex" xmlns:cx7="http://schemas.microsoft.com/office/drawing/2016/5/13/chartex" xmlns:cx8="http://schemas.microsoft.com/office/drawing/2016/5/14/chartex" xmlns:mc="http://schemas.openxmlformats.org/markup-compatibility/2006" xmlns:aink="http://schemas.microsoft.com/office/drawing/2016/ink" xmlns:am3d="http://schemas.microsoft.com/office/drawing/2017/model3d" xmlns:o="urn:schemas-microsoft-com:office:office" xmlns:r="http://schemas.openxmlformats.org/officeDocument/2006/relationships" xmlns:m="http://schemas.openxmlformats.org/officeDocument/2006/math" xmlns:v="urn:schemas-microsoft-com:vml" xmlns:wp14="http://schemas.microsoft.com/office/word/2010/wordprocessingDrawing" xmlns:wp="http://schemas.openxmlformats.org/drawingml/2006/wordprocessingDrawing" xmlns:w10="urn:schemas-microsoft-com:office:word" xmlns:w="http://schemas.openxmlformats.org/wordprocessingml/2006/main" xmlns:w14="http://schemas.microsoft.com/office/word/2010/wordml" xmlns:w15="http://schemas.microsoft.com/office/word/2012/wordml" xmlns:w16cex="http://schemas.microsoft.com/office/word/2018/wordml/cex" xmlns:w16cid="http://schemas.microsoft.com/office/word/2016/wordml/cid" xmlns:w16="http://schemas.microsoft.com/office/word/2018/wordml" xmlns:w16sdtdh="http://schemas.microsoft.com/office/word/2020/wordml/sdtdatahash" xmlns:w16se="http://schemas.microsoft.com/office/word/2015/wordml/symex" xmlns:wpg="http://schemas.microsoft.com/office/word/2010/wordprocessingGroup" xmlns:wpi="http://schemas.microsoft.com/office/word/2010/wordprocessingInk" xmlns:wne="http://schemas.microsoft.com/office/word/2006/wordml" xmlns:wps="http://schemas.microsoft.com/office/word/2010/wordprocessingShape" mc:Ignorable="w14 w15 w16se w16cid w16 w16cex w16sdtdh wp14">
   <w:body>
-{#weeks}
+    <w:p>
+      <w:pPr>
+        <w:spacing w:after="120" w:line="240" w:lineRule="auto"/>
+      </w:pPr>
+      <w:r>
+        <w:rPr>
+          <w:rFonts w:ascii="Arial" w:hAnsi="Arial" w:cs="Arial"/>
+          <w:color w:val="000000"/>
+          <w:sz w:val="24"/>
+          <w:szCs w:val="24"/>
+        </w:rPr>
+        <w:t xml:space="preserve">{#weeks}</w:t>
+      </w:r>
+    </w:p>
     <w:p>
       <w:pPr>
         <w:jc w:val="center"/>
@@ -671,7 +684,20 @@
         <w:spacing w:after="120" w:line="240" w:lineRule="auto"/>
       </w:pPr>
     </w:p>
-{/weeks}
+    <w:p>
+      <w:pPr>
+        <w:spacing w:after="120" w:line="240" w:lineRule="auto"/>
+      </w:pPr>
+      <w:r>
+        <w:rPr>
+          <w:rFonts w:ascii="Arial" w:hAnsi="Arial" w:cs="Arial"/>
+          <w:color w:val="000000"/>
+          <w:sz w:val="24"/>
+          <w:szCs w:val="24"/>
+        </w:rPr>
+        <w:t xml:space="preserve">{/weeks}</w:t>
+      </w:r>
+    </w:p>
     <w:sectPr>
       <w:headerReference w:type="default" r:id="rId7"/>
       <w:footerReference w:type="default" r:id="rId8"/>

</xml_diff>